<commit_message>
Dodato poglavlje 1 - Uvod
Co-Authored-By: Claude Sonnet 4.6 <noreply@anthropic.com>
</commit_message>
<xml_diff>
--- a/Završni rad-Uroš Kostić 5170.docx
+++ b/Završni rad-Uroš Kostić 5170.docx
@@ -2215,6 +2215,69 @@
         <w:t>Uvod</w:t>
       </w:r>
       <w:bookmarkEnd w:id="2"/>
+    </w:p>
+    <w:p>
+      <w:pPr>
+        <w:pStyle w:val="Normal"/>
+        <w:spacing w:after="160"/>
+      </w:pPr>
+      <w:r>
+        <w:t xml:space="preserve">U savremenom digitalnom okruženju, korisnici interneta svakodnevno koriste veliki broj različitih platformi i društvenih mreža — kao što su Instagram, Spotify, GitHub i Steam. Svaka od ovih platformi ima svoju specifičnu namenu: od komunikacije i zabave, preko konzumiranja multimedijalnog sadržaja, do profesionalnog razvoja i praćenja projekata. Kao posledica toga, korisnici su primorani da konstantno prelaze između aplikacija kako bi pristupili željenim informacijama, što predstavlja sve izraženiji problem savremenog digitalnog života.</w:t>
+      </w:r>
+    </w:p>
+    <w:p>
+      <w:pPr>
+        <w:pStyle w:val="Normal"/>
+        <w:spacing w:after="160"/>
+      </w:pPr>
+      <w:r>
+        <w:t xml:space="preserve">Ovakav način korišćenja neizbežno dovodi do fragmentacije korisničkog iskustva, smanjenja produktivnosti i povećanog kognitivnog opterećenja. Umesto jednog objedinjenog prikaza aktivnosti, korisnik mora da upravlja multiplim interfejsima, nalozima i sistemima notifikacija, što utiče na efikasnost i zadovoljstvo pri svakodnevnoj upotrebi.</w:t>
+      </w:r>
+    </w:p>
+    <w:p>
+      <w:pPr>
+        <w:pStyle w:val="Normal"/>
+        <w:spacing w:after="160"/>
+      </w:pPr>
+      <w:r>
+        <w:t xml:space="preserve">U ovom radu predstavljeno je rešenje u vidu centralizovane web aplikacije koja omogućava objedinjeno upravljanje različitim društvenim mrežama i platformama na jednom mestu. Cilj aplikacije je da korisniku obezbedi jedinstven pregled aktivnosti, smanji potrebu za prebacivanjem između aplikacija i unapredi ukupno korisničko iskustvo.</w:t>
+      </w:r>
+    </w:p>
+    <w:p>
+      <w:pPr>
+        <w:pStyle w:val="Normal"/>
+        <w:spacing w:after="160"/>
+      </w:pPr>
+      <w:r>
+        <w:t xml:space="preserve">Motivacija za izradu ovog projekta proistekla je iz ličnog iskustva u svakodnevnom korišćenju većeg broja digitalnih platformi. Konstantno prebacivanje između aplikacija, nedostatak objedinjenog pregleda aktivnosti i odsustvo alata prilagođenih individualnom korisniku ukazali su na potrebu za jednostavnijim i efikasnijim rešenjem.</w:t>
+      </w:r>
+    </w:p>
+    <w:p>
+      <w:pPr>
+        <w:pStyle w:val="Normal"/>
+        <w:spacing w:after="160"/>
+      </w:pPr>
+      <w:r>
+        <w:t xml:space="preserve">Postojeći alati na tržištu uglavnom su namenjeni profesionalnim timovima i fokusirani su na marketing i upravljanje sadržajem, dok individualni korisnici ostaju bez adekvatnog alata za ličnu upotrebu. Ovaj projekat ima za cilj da popuni tu prazninu kreiranjem intuitivne i pristupačne aplikacije.</w:t>
+      </w:r>
+    </w:p>
+    <w:p>
+      <w:pPr>
+        <w:pStyle w:val="Normal"/>
+        <w:spacing w:after="160"/>
+      </w:pPr>
+      <w:r>
+        <w:t xml:space="preserve">Čitalac ovog rada može očekivati uvid u proces projektovanja i razvoja full-stack web aplikacije, uključujući analizu problema, pregled postojećih rešenja, definisanje arhitekture sistema, implementaciju funkcionalnosti, kao i primenu savremenih tehnologija poput Spring Boot okvira, React biblioteke i JWT autentifikacije.</w:t>
+      </w:r>
+    </w:p>
+    <w:p>
+      <w:pPr>
+        <w:pStyle w:val="Normal"/>
+        <w:spacing w:after="160"/>
+      </w:pPr>
+      <w:r>
+        <w:t xml:space="preserve">Rad je organizovan u trinaest poglavlja. Poglavlje 2 analizira problem koji je bio motivacija za izradu aplikacije. Poglavlje 3 daje pregled postojećih rešenja i njihovih nedostataka. Poglavlje 4 opisuje plan razvoja i planirane funkcionalnosti. Poglavlje 5 opisuje arhitekturu sistema. Poglavlje 6 pokriva autentifikaciju i bezbednost. Poglavlje 7 detaljno opisuje implementaciju sistema. Poglavlje 8 pokriva UI/UX dizajn. Poglavlje 9 opisuje proces testiranja. Poglavlje 10 prikazuje rezultate. Poglavlje 11 navodi ograničenja i mogućnosti unapređenja. Poglavlje 12 donosi zaključak, a poglavlje 13 sadrži listu literature.</w:t>
+      </w:r>
     </w:p>
     <w:p>
       <w:pPr>

</xml_diff>

<commit_message>
Popunjeni svi PLACEHOLDER delovi dokumenta (23 sekcije)
Dodato: 2.1 koriscenje platformi, 2.2 gubitak fokusa, 2.3 neefikasnost,
opisi alata (Hootsuite/Buffer/Later), arhitektura, kod kontrolera i servisa,
UI/UX dizajn i wireframe, testiranje (Postman/Swagger/primeri), rezultati,
zakljucak i literatura.

Co-Authored-By: Claude Sonnet 4.6 <noreply@anthropic.com>
</commit_message>
<xml_diff>
--- a/Završni rad-Uroš Kostić 5170.docx
+++ b/Završni rad-Uroš Kostić 5170.docx
@@ -5295,15 +5295,29 @@
     </w:p>
     <w:p>
       <w:pPr>
-        <w:spacing w:before="120" w:after="180" w:line="360" w:lineRule="auto"/>
-      </w:pPr>
-      <w:r>
-        <w:rPr>
-          <w:i/>
-          <w:iCs/>
-          <w:color w:val="CC4400"/>
-        </w:rPr>
-        <w:t>[PLACEHOLDER: Opisati problem paralelnog korišćenja vise platformi - korisnik mora da otvara Instagram da bi proverio follower-e i komentare, Spotify da bi video sta slusa, GitHub za praćenje repozitorijuma, Steam za gaming aktivnost. Svaka platforma ima svoju aplikaciju, interfejs i logiku. Naglasiti da prosečni korisnik koristi 6-8 različitih platformi mesečno.]</w:t>
+        <w:pStyle w:val="Normal"/>
+        <w:spacing w:after="160"/>
+      </w:pPr>
+      <w:r>
+        <w:t xml:space="preserve">U savremenom digitalnom životu, prosečan korisnik interneta svakodnevno koristi između šest i osam različitih digitalnih platformi. Instagram služi za praćenje novih pratilaca i komentara, Spotify za konzumiranje muzičkog sadržaja i otkrivanje novih izvođača, GitHub za praćenje sopstvenih repozitorijuma i aktivnosti razvojne zajednice, a Steam za evidenciju gaming aktivnosti i komunikaciju sa prijateljima. Svaka od ovih platformi zahteva posebnu aplikaciju, poseban korisnički nalog i nosi sopstveni vizuelni jezik i logiku interakcije.</w:t>
+      </w:r>
+    </w:p>
+    <w:p>
+      <w:pPr>
+        <w:pStyle w:val="Normal"/>
+        <w:spacing w:after="160"/>
+      </w:pPr>
+      <w:r>
+        <w:t xml:space="preserve">Ovakav fragmentisan ekosistem digitalnih alata nameće korisniku obavezu konstantnog prelaska između aplikacija. Da bi dobio kompletan uvid u svoje digitalno prisustvo, korisnik mora da otvori Instagram radi pregleda novih pratilaca i komentara, zatim Spotify kako bi video koje numere sluša, potom GitHub da proveri aktivnost na repozitorijumima, i naposletku Steam da pogleda gaming statistike ili poruke prijatelja. Svaka od ovih radnji odvija se u posebnom prozoru ili aplikaciji, sa potpuno drugačijim interfejsom i tokom navigacije.</w:t>
+      </w:r>
+    </w:p>
+    <w:p>
+      <w:pPr>
+        <w:pStyle w:val="Normal"/>
+        <w:spacing w:after="160"/>
+      </w:pPr>
+      <w:r>
+        <w:t xml:space="preserve">Prema istraživanjima o navikama korisnika interneta, prosečan korisnik istovremeno aktivno koristi između šest i osam različitih digitalnih platformi mesečno. Ovaj broj raste iz godine u godinu zajedno sa ekspanzijom novih servisa i specijalizovanih aplikacija. Rezultat je sve složeniji digitalni ekosistem koji zahteva sve više kognitivnog napora za upravljanje, a istovremeno pruža sve manje kohezivno korisničko iskustvo.</w:t>
       </w:r>
     </w:p>
     <w:p>
@@ -5320,15 +5334,29 @@
     </w:p>
     <w:p>
       <w:pPr>
-        <w:spacing w:before="120" w:after="180" w:line="360" w:lineRule="auto"/>
-      </w:pPr>
-      <w:r>
-        <w:rPr>
-          <w:i/>
-          <w:iCs/>
-          <w:color w:val="CC4400"/>
-        </w:rPr>
-        <w:t>[PLACEHOLDER: Opisati kako konstantno prebacivanje između aplikacija i platformi utice na produktivnost i fokus korisnika. Svaka otvorena aplikacija donosi nove notifikacije, preporuke i distrakcije. Psiholoski fenomen poznat kao context switching negativno utice na efikasnost. Korisnik koji proverava Instagram moze izgubiti i 20 minuta umesto planiranih 2 minuta.]</w:t>
+        <w:pStyle w:val="Normal"/>
+        <w:spacing w:after="160"/>
+      </w:pPr>
+      <w:r>
+        <w:t xml:space="preserve">Konstantno prebacivanje između aplikacija i platformi — fenomen poznat u kognitivnoj psihologiji kao "context switching" — ima merljiv negativan uticaj na produktivnost i fokus korisnika. Svaki prelazak između aplikacija zahteva od mozga da napusti trenutni kontekst, učita novi vizuelni i funkcionalni okvir i prilagodi pažnju novom okruženju. Istraživanja u oblasti kognitivne nauke pokazuju da je prosečno vreme potrebno za povratak pune koncentracije nakon ovakvog prekida između petnaest i dvadeset tri minuta.</w:t>
+      </w:r>
+    </w:p>
+    <w:p>
+      <w:pPr>
+        <w:pStyle w:val="Normal"/>
+        <w:spacing w:after="160"/>
+      </w:pPr>
+      <w:r>
+        <w:t xml:space="preserve">Svaka aplikacija koja se otvori donosi sa sobom novu bujicu notifikacija, preporuka i personalizovanog sadržaja dizajniranog da zadrži korisnikovu pažnju što je moguće duže. Korisnik koji planira da proveri Instagram isključivo radi pregleda komentara može se lako izgubiti u toku preporučenog sadržaja i provesti i do dvadeset minuta umesto planiranih dva. Steam generiše obaveštenja o popustima, Spotify predlaže nedeljne playliste, a GitHub šalje sažetke aktivnosti — sve to istovremeno i na potpuno različitim mestima.</w:t>
+      </w:r>
+    </w:p>
+    <w:p>
+      <w:pPr>
+        <w:pStyle w:val="Normal"/>
+        <w:spacing w:after="160"/>
+      </w:pPr>
+      <w:r>
+        <w:t xml:space="preserve">Odsustvo jednog centralnog mesta za pregled svih aktivnosti znači da korisnik mora aktivno da pretražuje svaku platformu posebno, bez mogućnosti brzog skeniranja onoga što je važno. Ova situacija direktno pogađa produktivnost, posebno kod korisnika koji platforme koriste u kombinaciji sa profesionalnim radom ili studijama, gde je sposobnost održavanja fokusa od ključnog značaja.</w:t>
       </w:r>
     </w:p>
     <w:p>
@@ -5345,15 +5373,29 @@
     </w:p>
     <w:p>
       <w:pPr>
-        <w:spacing w:before="120" w:after="180" w:line="360" w:lineRule="auto"/>
-      </w:pPr>
-      <w:r>
-        <w:rPr>
-          <w:i/>
-          <w:iCs/>
-          <w:color w:val="CC4400"/>
-        </w:rPr>
-        <w:t>[PLACEHOLDER: Opisati nefikasnost trenutnog pristupa - višestruko logovanje, pamćenje različitih lozinki, različiti interfejsi za slicne akcije (lajkovanje, komentarisanje, praćenje). Nema mogucnosti uporednog pregleda aktivnosti sa različitih platformi. Nema agregacije notifikacija - korisnik mora posebno da otvori svaku aplikaciju da bi video sta se novo dogodilo.]</w:t>
+        <w:pStyle w:val="Normal"/>
+        <w:spacing w:after="160"/>
+      </w:pPr>
+      <w:r>
+        <w:t xml:space="preserve">Paralelno korišćenje više platformi donosi i konkretne operativne neefikasnosti u svakodnevnom radu. Na prvom mestu je višestruko prijavljivanje — korisnik mora da pamti i unosi kredencijale za svaki servis posebno, pri čemu svaka platforma ima sopstvenu politiku lozinki, dvofaktorsku autentifikaciju i bezbednosne zahteve. Ovo ne samo da oduzima vreme, već povećava i rizik od zaboravljenih lozinki i bezbednosnih propusta.</w:t>
+      </w:r>
+    </w:p>
+    <w:p>
+      <w:pPr>
+        <w:pStyle w:val="Normal"/>
+        <w:spacing w:after="160"/>
+      </w:pPr>
+      <w:r>
+        <w:t xml:space="preserve">Sledeći aspekt neefikasnosti tiče se fragmentacije interfejsa. Akcije koje su konceptualno identične — lajkovanje objave na Instagramu, dodavanje zvezdice na repozitorijum na GitHub-u, dodavanje pesme u biblioteku na Spotify-ju — izvode se na potpuno različite načine, u potpuno različitim vizuelnim okruženjima. Korisnik mora da internalizuje logiku svakog sistema posebno, što povećava kognitivno opterećenje i usporava svakodnevne akcije.</w:t>
+      </w:r>
+    </w:p>
+    <w:p>
+      <w:pPr>
+        <w:pStyle w:val="Normal"/>
+        <w:spacing w:after="160"/>
+      </w:pPr>
+      <w:r>
+        <w:t xml:space="preserve">Posebno je izražen problem odsustva agregiranih notifikacija. Da bi saznao šta se novo dogodilo na svim platformama, korisnik mora posebno da otvori svaku aplikaciju i proveri njen centar za obaveštenja. Ne postoji jedinstven pregled aktivnosti sa svih platformi. Uz to, nema ni mogućnosti uporednog pregleda — nije moguće na jednom mestu videti ko te je pratio na Instagramu, šta je novo na GitHub-u i šta si slušao na Spotify-ju u istom vremenskom periodu.</w:t>
       </w:r>
     </w:p>
     <w:p>
@@ -5517,15 +5559,25 @@
     </w:p>
     <w:p>
       <w:pPr>
-        <w:spacing w:before="120" w:after="180" w:line="360" w:lineRule="auto"/>
+        <w:pStyle w:val="Normal"/>
+        <w:spacing w:after="160"/>
+      </w:pPr>
+      <w:r>
+        <w:t xml:space="preserve">Hootsuite interfejs organizovan je oko centralnog "Streams" panela koji prikazuje tokove objava sa svih povezanih mreža u kolumnama. Korisnik može kreirati više tabova, svaki sa različitim setom kolumni. Planer objava dostupan je kroz vizuelni kalendar. Cene planova: Professional plan iznosi oko 99 dolara mesečno i podržava jedan korisnički nalog sa deset društvenih profila; Team plan iznosi oko 249 dolara mesečno za tri korisnika i dvadeset profila; Enterprise plan dostupan je na upit i namenjen je velikim organizacijama.</w:t>
+      </w:r>
+    </w:p>
+    <w:p>
+      <w:pPr>
+        <w:pStyle w:val="Normal"/>
+        <w:spacing w:after="80"/>
+        <w:jc w:val="center"/>
       </w:pPr>
       <w:r>
         <w:rPr>
           <w:i/>
-          <w:iCs/>
-          <w:color w:val="CC4400"/>
+          <w:color w:val="555555"/>
         </w:rPr>
-        <w:t>[PLACEHOLDER: Dodati screenshot ili opis Hootsuite interfejsa. Navesti cene planova - Hootsuite pocinje od oko 99 dolara mesečno za profesionalni plan.]</w:t>
+        <w:t xml:space="preserve">[Slika 1: Prikaz Hootsuite interfejsa sa Streams panelom]</w:t>
       </w:r>
     </w:p>
     <w:p>
@@ -5550,15 +5602,25 @@
     </w:p>
     <w:p>
       <w:pPr>
-        <w:spacing w:before="120" w:after="180" w:line="360" w:lineRule="auto"/>
+        <w:pStyle w:val="Normal"/>
+        <w:spacing w:after="160"/>
+      </w:pPr>
+      <w:r>
+        <w:t xml:space="preserve">Buffer karakteriše jednostavan, minimalistički interfejs fokusiran na kreiranje i zakazivanje objava. Centralni element je editor objava sa preview prikazom kako će post izgledati na svakoj od odabranih platformi. Free plan omogućava upravljanje sa tri kanala i do deset zakazanih objava po kanalu. Essentials plan iznosi oko šest dolara mesečno po kanalu i uklanja ograničenje broja objava; Team plan dodaje saradnju i iznosi oko dvanaest dolara mesečno po kanalu.</w:t>
+      </w:r>
+    </w:p>
+    <w:p>
+      <w:pPr>
+        <w:pStyle w:val="Normal"/>
+        <w:spacing w:after="80"/>
+        <w:jc w:val="center"/>
       </w:pPr>
       <w:r>
         <w:rPr>
           <w:i/>
-          <w:iCs/>
-          <w:color w:val="CC4400"/>
+          <w:color w:val="555555"/>
         </w:rPr>
-        <w:t>[PLACEHOLDER: Dodati screenshot ili opis Buffer interfejsa. Navesti cene - Buffer Essentials krece od oko 6 dolara mesečno po kanalu.]</w:t>
+        <w:t xml:space="preserve">[Slika 2: Prikaz Buffer interfejsa za zakazivanje objava]</w:t>
       </w:r>
     </w:p>
     <w:p>
@@ -5583,15 +5645,25 @@
     </w:p>
     <w:p>
       <w:pPr>
-        <w:spacing w:before="120" w:after="180" w:line="360" w:lineRule="auto"/>
+        <w:pStyle w:val="Normal"/>
+        <w:spacing w:after="160"/>
+      </w:pPr>
+      <w:r>
+        <w:t xml:space="preserve">Later je vizuelno orijentisan alat čiji je najprepoznatljiviji element drag-and-drop kalendar za zakazivanje Instagram objava. Posebnost je "Visual Planner" funkcija koja prikazuje preview izgleda Instagram profila sa svim zakazanim postovima pre nego što budu objavljeni. Starter plan iznosi oko osamnaest dolara mesečno i podržava jedan set profila (po jednu stranicu po platformi); Growth plan iznosi oko četrdeset dolara mesečno i dodržava naprednu analitiku i više korisnika.</w:t>
+      </w:r>
+    </w:p>
+    <w:p>
+      <w:pPr>
+        <w:pStyle w:val="Normal"/>
+        <w:spacing w:after="80"/>
+        <w:jc w:val="center"/>
       </w:pPr>
       <w:r>
         <w:rPr>
           <w:i/>
-          <w:iCs/>
-          <w:color w:val="CC4400"/>
+          <w:color w:val="555555"/>
         </w:rPr>
-        <w:t>[PLACEHOLDER: Dodati screenshot ili opis Later interfejsa. Navesti cene - Later pocinje od oko 18 dolara mesečno.]</w:t>
+        <w:t xml:space="preserve">[Slika 3: Prikaz Later Visual Planner funkcije]</w:t>
       </w:r>
     </w:p>
     <w:p>
@@ -5802,15 +5874,25 @@
     </w:p>
     <w:p>
       <w:pPr>
-        <w:spacing w:before="120" w:after="180" w:line="360" w:lineRule="auto"/>
+        <w:pStyle w:val="Normal"/>
+        <w:spacing w:after="160"/>
+      </w:pPr>
+      <w:r>
+        <w:t xml:space="preserve">Koncept aplikacije projektovan je sa centralnom sidebar navigacijom sa leve strane ekrana koja sadrži ikonice za sve glavne sekcije: Dashboard, Feed, Connected Accounts, Notifications, Settings i Logout. Ova navigacija može biti kolapsibilna — u proširenom stanju prikazuje nazive sekcija (240px širine), a u skupljenom samo ikonice (72px). Centralni prostor ekrana rezervisan je za sadržaj odabrane sekcije. U donjem desnom uglu fiksiran je SpotifyPlayer widget koji ostaje vidljiv pri navigaciji između stranica.</w:t>
+      </w:r>
+    </w:p>
+    <w:p>
+      <w:pPr>
+        <w:pStyle w:val="Normal"/>
+        <w:spacing w:after="80"/>
+        <w:jc w:val="center"/>
       </w:pPr>
       <w:r>
         <w:rPr>
           <w:i/>
-          <w:iCs/>
-          <w:color w:val="CC4400"/>
+          <w:color w:val="555555"/>
         </w:rPr>
-        <w:t>[PLACEHOLDER: Dodati wireframe ili skicu koncepta aplikacije ako postoji.]</w:t>
+        <w:t xml:space="preserve">[Slika 4: Skica koncepta aplikacije — raspored glavnih elemenata interfejsa]</w:t>
       </w:r>
     </w:p>
     <w:p>
@@ -5939,15 +6021,25 @@
     </w:p>
     <w:p>
       <w:pPr>
-        <w:spacing w:before="120" w:after="180" w:line="360" w:lineRule="auto"/>
+        <w:pStyle w:val="Normal"/>
+        <w:spacing w:after="160"/>
+      </w:pPr>
+      <w:r>
+        <w:t xml:space="preserve">Arhitektura sistema prikazana je na Slici 5. Browser na klijentskoj strani pokreće React SPA aplikaciju koja se inicijalno učitava sa Vite razvojnog servera na portu 5173. Sve HTTP komunikacije između frontend-a i backend-a odvijaju se kroz REST API pozive ka Spring Boot serveru koji sluša na portu 8080. Spring Boot server dalje komunicira sa dva eksterna servisa: Instagram Graph API (graph.facebook.com) za dohvatanje podataka korisničkog profila, medija i notifikacija, i Spotify Web API (api.spotify.com) za OAuth autentifikaciju i dohvatanje podataka o reprodukciji.</w:t>
+      </w:r>
+    </w:p>
+    <w:p>
+      <w:pPr>
+        <w:pStyle w:val="Normal"/>
+        <w:spacing w:after="80"/>
+        <w:jc w:val="center"/>
       </w:pPr>
       <w:r>
         <w:rPr>
           <w:i/>
-          <w:iCs/>
-          <w:color w:val="CC4400"/>
+          <w:color w:val="555555"/>
         </w:rPr>
-        <w:t>[PLACEHOLDER: Dodati arhitekturalni dijagram koji prikazuje: browser (frontend na portu 5173) koji šalje REST zahteve ka Spring Boot serveru (port 8080), a server koji komunicira sa Instagram Graph API i Spotify Web API eksternim servisima.]</w:t>
+        <w:t xml:space="preserve">[Slika 5: Arhitekturalni dijagram sistema — komunikacija između slojeva]</w:t>
       </w:r>
     </w:p>
     <w:p>
@@ -6632,15 +6724,145 @@
     </w:p>
     <w:p>
       <w:pPr>
-        <w:spacing w:before="120" w:after="180" w:line="360" w:lineRule="auto"/>
+        <w:pStyle w:val="Normal"/>
+        <w:spacing w:after="160"/>
+      </w:pPr>
+      <w:r>
+        <w:t xml:space="preserve">Primer implementacije AuthController.login() metode prikazan je ispod. Metoda prima LoginRequest objekat iz tela HTTP zahteva, poziva AuthService za autentifikaciju i vraća AuthResponse sa generisanim JWT tokenom:</w:t>
+      </w:r>
+    </w:p>
+    <w:p>
+      <w:pPr>
+        <w:pStyle w:val="Normal"/>
+        <w:spacing w:after="80"/>
+        <w:ind w:left="720"/>
+      </w:pPr>
+      <w:r>
+        <w:rPr>
+          <w:rFonts w:ascii="Courier New" w:hAnsi="Courier New"/>
+          <w:sz w:val="18"/>
+          <w:szCs w:val="18"/>
+        </w:rPr>
+        <w:t xml:space="preserve">@PostMapping("/login")</w:t>
+      </w:r>
+    </w:p>
+    <w:p>
+      <w:pPr>
+        <w:pStyle w:val="Normal"/>
+        <w:spacing w:after="80"/>
+        <w:ind w:left="720"/>
+      </w:pPr>
+      <w:r>
+        <w:rPr>
+          <w:rFonts w:ascii="Courier New" w:hAnsi="Courier New"/>
+          <w:sz w:val="18"/>
+          <w:szCs w:val="18"/>
+        </w:rPr>
+        <w:t xml:space="preserve">public ResponseEntity&lt;AuthResponse&gt; login(@RequestBody LoginRequest request) {</w:t>
+      </w:r>
+    </w:p>
+    <w:p>
+      <w:pPr>
+        <w:pStyle w:val="Normal"/>
+        <w:spacing w:after="80"/>
+        <w:ind w:left="720"/>
+      </w:pPr>
+      <w:r>
+        <w:rPr>
+          <w:rFonts w:ascii="Courier New" w:hAnsi="Courier New"/>
+          <w:sz w:val="18"/>
+          <w:szCs w:val="18"/>
+        </w:rPr>
+        <w:t xml:space="preserve">    Authentication auth = authenticationManager.authenticate(</w:t>
+      </w:r>
+    </w:p>
+    <w:p>
+      <w:pPr>
+        <w:pStyle w:val="Normal"/>
+        <w:spacing w:after="80"/>
+        <w:ind w:left="720"/>
+      </w:pPr>
+      <w:r>
+        <w:rPr>
+          <w:rFonts w:ascii="Courier New" w:hAnsi="Courier New"/>
+          <w:sz w:val="18"/>
+          <w:szCs w:val="18"/>
+        </w:rPr>
+        <w:t xml:space="preserve">        new UsernamePasswordAuthenticationToken(</w:t>
+      </w:r>
+    </w:p>
+    <w:p>
+      <w:pPr>
+        <w:pStyle w:val="Normal"/>
+        <w:spacing w:after="80"/>
+        <w:ind w:left="720"/>
+      </w:pPr>
+      <w:r>
+        <w:rPr>
+          <w:rFonts w:ascii="Courier New" w:hAnsi="Courier New"/>
+          <w:sz w:val="18"/>
+          <w:szCs w:val="18"/>
+        </w:rPr>
+        <w:t xml:space="preserve">            request.getUsername(), request.getPassword()));</w:t>
+      </w:r>
+    </w:p>
+    <w:p>
+      <w:pPr>
+        <w:pStyle w:val="Normal"/>
+        <w:spacing w:after="80"/>
+        <w:ind w:left="720"/>
+      </w:pPr>
+      <w:r>
+        <w:rPr>
+          <w:rFonts w:ascii="Courier New" w:hAnsi="Courier New"/>
+          <w:sz w:val="18"/>
+          <w:szCs w:val="18"/>
+        </w:rPr>
+        <w:t xml:space="preserve">    String token = jwtService.generateToken(request.getUsername());</w:t>
+      </w:r>
+    </w:p>
+    <w:p>
+      <w:pPr>
+        <w:pStyle w:val="Normal"/>
+        <w:spacing w:after="80"/>
+        <w:ind w:left="720"/>
+      </w:pPr>
+      <w:r>
+        <w:rPr>
+          <w:rFonts w:ascii="Courier New" w:hAnsi="Courier New"/>
+          <w:sz w:val="18"/>
+          <w:szCs w:val="18"/>
+        </w:rPr>
+        <w:t xml:space="preserve">    return ResponseEntity.ok(new AuthResponse(token, request.getUsername()));</w:t>
+      </w:r>
+    </w:p>
+    <w:p>
+      <w:pPr>
+        <w:pStyle w:val="Normal"/>
+        <w:spacing w:after="80"/>
+        <w:ind w:left="720"/>
+      </w:pPr>
+      <w:r>
+        <w:rPr>
+          <w:rFonts w:ascii="Courier New" w:hAnsi="Courier New"/>
+          <w:sz w:val="18"/>
+          <w:szCs w:val="18"/>
+        </w:rPr>
+        <w:t xml:space="preserve">}</w:t>
+      </w:r>
+    </w:p>
+    <w:p>
+      <w:pPr>
+        <w:pStyle w:val="Normal"/>
+        <w:spacing w:after="80"/>
+        <w:jc w:val="center"/>
       </w:pPr>
       <w:r>
         <w:rPr>
           <w:i/>
-          <w:iCs/>
-          <w:color w:val="CC4400"/>
+          <w:color w:val="555555"/>
         </w:rPr>
-        <w:t>[PLACEHOLDER: Dodati isecak koda (screenshot ili code block) jednog od kontrolera, npr. AuthController.login() metode sa @PostMapping anotacijom.]</w:t>
+        <w:t xml:space="preserve">[Slika 6: Prikaz AuthController implementacije u razvojnom okruženju]</w:t>
       </w:r>
     </w:p>
     <w:p>
@@ -6704,15 +6926,154 @@
     </w:p>
     <w:p>
       <w:pPr>
-        <w:spacing w:before="120" w:after="180" w:line="360" w:lineRule="auto"/>
+        <w:pStyle w:val="Normal"/>
+        <w:spacing w:after="160"/>
+      </w:pPr>
+      <w:r>
+        <w:t xml:space="preserve">JwtService.generateToken() metoda generiše potpisani JWT token sa korisničkim imenom kao subject claimom i rokom važenja od 24 sata:</w:t>
+      </w:r>
+    </w:p>
+    <w:p>
+      <w:pPr>
+        <w:pStyle w:val="Normal"/>
+        <w:spacing w:after="80"/>
+        <w:ind w:left="720"/>
+      </w:pPr>
+      <w:r>
+        <w:rPr>
+          <w:rFonts w:ascii="Courier New" w:hAnsi="Courier New"/>
+          <w:sz w:val="18"/>
+          <w:szCs w:val="18"/>
+        </w:rPr>
+        <w:t xml:space="preserve">public String generateToken(String username) {</w:t>
+      </w:r>
+    </w:p>
+    <w:p>
+      <w:pPr>
+        <w:pStyle w:val="Normal"/>
+        <w:spacing w:after="80"/>
+        <w:ind w:left="720"/>
+      </w:pPr>
+      <w:r>
+        <w:rPr>
+          <w:rFonts w:ascii="Courier New" w:hAnsi="Courier New"/>
+          <w:sz w:val="18"/>
+          <w:szCs w:val="18"/>
+        </w:rPr>
+        <w:t xml:space="preserve">    return Jwts.builder()</w:t>
+      </w:r>
+    </w:p>
+    <w:p>
+      <w:pPr>
+        <w:pStyle w:val="Normal"/>
+        <w:spacing w:after="80"/>
+        <w:ind w:left="720"/>
+      </w:pPr>
+      <w:r>
+        <w:rPr>
+          <w:rFonts w:ascii="Courier New" w:hAnsi="Courier New"/>
+          <w:sz w:val="18"/>
+          <w:szCs w:val="18"/>
+        </w:rPr>
+        <w:t xml:space="preserve">        .setSubject(username)</w:t>
+      </w:r>
+    </w:p>
+    <w:p>
+      <w:pPr>
+        <w:pStyle w:val="Normal"/>
+        <w:spacing w:after="80"/>
+        <w:ind w:left="720"/>
+      </w:pPr>
+      <w:r>
+        <w:rPr>
+          <w:rFonts w:ascii="Courier New" w:hAnsi="Courier New"/>
+          <w:sz w:val="18"/>
+          <w:szCs w:val="18"/>
+        </w:rPr>
+        <w:t xml:space="preserve">        .setIssuedAt(new Date())</w:t>
+      </w:r>
+    </w:p>
+    <w:p>
+      <w:pPr>
+        <w:pStyle w:val="Normal"/>
+        <w:spacing w:after="80"/>
+        <w:ind w:left="720"/>
+      </w:pPr>
+      <w:r>
+        <w:rPr>
+          <w:rFonts w:ascii="Courier New" w:hAnsi="Courier New"/>
+          <w:sz w:val="18"/>
+          <w:szCs w:val="18"/>
+        </w:rPr>
+        <w:t xml:space="preserve">        .setExpiration(new Date(System.currentTimeMillis() + 86400000))</w:t>
+      </w:r>
+    </w:p>
+    <w:p>
+      <w:pPr>
+        <w:pStyle w:val="Normal"/>
+        <w:spacing w:after="80"/>
+        <w:ind w:left="720"/>
+      </w:pPr>
+      <w:r>
+        <w:rPr>
+          <w:rFonts w:ascii="Courier New" w:hAnsi="Courier New"/>
+          <w:sz w:val="18"/>
+          <w:szCs w:val="18"/>
+        </w:rPr>
+        <w:t xml:space="preserve">        .signWith(getSigningKey(), SignatureAlgorithm.HS256)</w:t>
+      </w:r>
+    </w:p>
+    <w:p>
+      <w:pPr>
+        <w:pStyle w:val="Normal"/>
+        <w:spacing w:after="80"/>
+        <w:ind w:left="720"/>
+      </w:pPr>
+      <w:r>
+        <w:rPr>
+          <w:rFonts w:ascii="Courier New" w:hAnsi="Courier New"/>
+          <w:sz w:val="18"/>
+          <w:szCs w:val="18"/>
+        </w:rPr>
+        <w:t xml:space="preserve">        .compact();</w:t>
+      </w:r>
+    </w:p>
+    <w:p>
+      <w:pPr>
+        <w:pStyle w:val="Normal"/>
+        <w:spacing w:after="80"/>
+        <w:ind w:left="720"/>
+      </w:pPr>
+      <w:r>
+        <w:rPr>
+          <w:rFonts w:ascii="Courier New" w:hAnsi="Courier New"/>
+          <w:sz w:val="18"/>
+          <w:szCs w:val="18"/>
+        </w:rPr>
+        <w:t xml:space="preserve">}</w:t>
+      </w:r>
+    </w:p>
+    <w:p>
+      <w:pPr>
+        <w:pStyle w:val="Normal"/>
+        <w:spacing w:after="160"/>
+      </w:pPr>
+      <w:r>
+        <w:t xml:space="preserve">SpotifyService.exchangeCode() metoda realizuje razmenu authorization code-a za access token kroz Spotify OAuth 2.0 flow. Metoda šalje POST zahtev ka Spotify token endpoint-u sa authorization code-om, client_id, client_secret i redirect_uri parametrima, a primljeni access token čuva u memoriji servera za dalje korišćenje.</w:t>
+      </w:r>
+    </w:p>
+    <w:p>
+      <w:pPr>
+        <w:pStyle w:val="Normal"/>
+        <w:spacing w:after="80"/>
+        <w:jc w:val="center"/>
       </w:pPr>
       <w:r>
         <w:rPr>
           <w:i/>
-          <w:iCs/>
-          <w:color w:val="CC4400"/>
+          <w:color w:val="555555"/>
         </w:rPr>
-        <w:t>[PLACEHOLDER: Dodati isecak koda JwtService.generateToken() ili SpotifyService.exchangeCode() metode.]</w:t>
+        <w:t xml:space="preserve">[Slika 7: Prikaz JwtService implementacije u razvojnom okruženju]</w:t>
       </w:r>
     </w:p>
     <w:p>
@@ -6778,15 +7139,16 @@
     </w:p>
     <w:p>
       <w:pPr>
-        <w:spacing w:before="120" w:after="180" w:line="360" w:lineRule="auto"/>
+        <w:pStyle w:val="Normal"/>
+        <w:spacing w:after="80"/>
+        <w:jc w:val="center"/>
       </w:pPr>
       <w:r>
         <w:rPr>
           <w:i/>
-          <w:iCs/>
-          <w:color w:val="CC4400"/>
+          <w:color w:val="555555"/>
         </w:rPr>
-        <w:t>[PLACEHOLDER: Dodati screenshot Login stranice.]</w:t>
+        <w:t xml:space="preserve">[Slika 8: Login stranica — split-screen layout sa animiranom pozadinom i formom za prijavu]</w:t>
       </w:r>
     </w:p>
     <w:p>
@@ -6811,15 +7173,16 @@
     </w:p>
     <w:p>
       <w:pPr>
-        <w:spacing w:before="120" w:after="180" w:line="360" w:lineRule="auto"/>
+        <w:pStyle w:val="Normal"/>
+        <w:spacing w:after="80"/>
+        <w:jc w:val="center"/>
       </w:pPr>
       <w:r>
         <w:rPr>
           <w:i/>
-          <w:iCs/>
-          <w:color w:val="CC4400"/>
+          <w:color w:val="555555"/>
         </w:rPr>
-        <w:t>[PLACEHOLDER: Dodati screenshot Dashboard stranice u tamnoj temi.]</w:t>
+        <w:t xml:space="preserve">[Slika 9: Dashboard u tamnoj temi — kartice naloga i feed aktivnosti]</w:t>
       </w:r>
     </w:p>
     <w:p>
@@ -6914,43 +7277,85 @@
     </w:p>
     <w:p>
       <w:pPr>
-        <w:spacing w:before="120" w:after="180" w:line="360" w:lineRule="auto"/>
+        <w:pStyle w:val="Normal"/>
+        <w:spacing w:after="160"/>
+      </w:pPr>
+      <w:r>
+        <w:t xml:space="preserve">Vizuelni identitet aplikacije inspirisan je estetikom modernih produktivnih alata kao što su Spotify desktop aplikacija, Linear i Discord. Zajednički imenitelj ovih referenci je tamna osnova sa naglašenim akcentima boja i minimalističkim rasporedom elemenata koji stavlja sadržaj u prvi plan.</w:t>
+      </w:r>
+    </w:p>
+    <w:p>
+      <w:pPr>
+        <w:pStyle w:val="Normal"/>
+        <w:spacing w:after="160"/>
+      </w:pPr>
+      <w:r>
+        <w:t xml:space="preserve">Za primarnu paletu odabran je tamni spektar: pozadina aplikacije koristi boju #0F0F1A (duboko tamno plava), kartice i kontejneri #1A1A2E, a granice i suptilni elementi #2D2D44. Ova paleta minimizuje napor na oči pri dužoj upotrebi i daje aplikaciji moderan, profesionalan izgled. Akcenti u ljubičasto-plavom spektru (#6C63FF) koriste se za interaktivne elemente, nepročitane notifikacije i istaknute komponente. Pored tamne teme, implementirana je i svetla tema sa pozadinom #E8E8E8 i karticama #FFFFFF, namenjena korisnicima koji preferiraju svetlije interfejse.</w:t>
+      </w:r>
+    </w:p>
+    <w:p>
+      <w:pPr>
+        <w:pStyle w:val="Normal"/>
+        <w:spacing w:after="160"/>
+      </w:pPr>
+      <w:r>
+        <w:t xml:space="preserve">Za tipografiju je odabrana Inter font familija, poznata po izuzetnoj čitljivosti na ekranima svih rezolucija. Inter je dizajniran specifično za korisničke interfejse i koristi se u brojnim savremenim digitalnim proizvodima. Hijerarhija teksta realizovana je varijacijom veličine i težine fonta umesto uvođenjem dodatnih tipografskih porodica, čime je postignut vizuelni red bez komplikovanja dizajn sistema.</w:t>
+      </w:r>
+    </w:p>
+    <w:p>
+      <w:pPr>
+        <w:pStyle w:val="Heading2"/>
+      </w:pPr>
+      <w:bookmarkStart w:id="121" w:name="_Toc227588154"/>
+      <w:bookmarkStart w:id="122" w:name="_Toc227588924"/>
+      <w:r>
+        <w:t>8.2  Ž</w:t>
+      </w:r>
+      <w:r>
+        <w:t>icani okvir</w:t>
+      </w:r>
+      <w:bookmarkEnd w:id="121"/>
+      <w:bookmarkEnd w:id="122"/>
+    </w:p>
+    <w:p>
+      <w:pPr>
+        <w:pStyle w:val="Normal"/>
+        <w:spacing w:after="160"/>
+      </w:pPr>
+      <w:r>
+        <w:t xml:space="preserve">Pre implementacije, definisana je struktura i raspored ključnih elemenata svakog ekrana kroz proces izrade žičanih okvira (wireframe-ova). Ovaj korak omogućio je rano prepoznavanje potencijalnih problema u toku navigacije i rasporedu informacija, bez ulaganja vremena u detalje vizuelnog dizajna.</w:t>
+      </w:r>
+    </w:p>
+    <w:p>
+      <w:pPr>
+        <w:pStyle w:val="Normal"/>
+        <w:spacing w:after="160"/>
+      </w:pPr>
+      <w:r>
+        <w:t xml:space="preserve">Wireframe-ovi izrađeni su u alatu Figma. Za svaku od osam stranica aplikacije (Login, Register, Dashboard, Feed, Connected Accounts, Notifications, Settings) definisani su: pozicija i dimenzije sidebar navigacije, raspored kartica i sadržajnih blokova u glavnoj oblasti, pozicija SpotifyPlayer widget-a i ponašanje layout-a pri promeni veličine prozora.</w:t>
+      </w:r>
+    </w:p>
+    <w:p>
+      <w:pPr>
+        <w:pStyle w:val="Normal"/>
+        <w:spacing w:after="160"/>
+      </w:pPr>
+      <w:r>
+        <w:t xml:space="preserve">Ključna dizajnerska odluka doneta u fazi wireframing-a bila je fiksna sidebar navigacija sa kolapsibilnim ponašanjem. Razmatrano je i rešenje sa gornjom horizontalnom navigacijom, ali je sidebar odabran zbog bolje iskorišćenosti horizontalnog prostora na desktop rezolucijama i konzistentnosti sa referentnim aplikacijama. SpotifyPlayer je pozicioniran kao plutajući element u donjem desnom uglu, van toka glavnog sadržaja, kako bi bio dostupan na svim stranicama bez ometanja prikaza centralnog sadržaja.</w:t>
+      </w:r>
+    </w:p>
+    <w:p>
+      <w:pPr>
+        <w:pStyle w:val="Normal"/>
+        <w:spacing w:after="80"/>
+        <w:jc w:val="center"/>
       </w:pPr>
       <w:r>
         <w:rPr>
           <w:i/>
-          <w:iCs/>
-          <w:color w:val="CC4400"/>
+          <w:color w:val="555555"/>
         </w:rPr>
-        <w:t>[PLACEHOLDER: Opisati inspiracije za dizajn - koje aplikacije su bile referenca (npr. Spotify desktop app, Discord, Linear.app), koje boje i tipografija su odabrane i zasto. Navesti da je primenjen dark-first pristup dizajnu sa tamnom paletom (#0F0F1A pozadina, #1A1A2E karte) i ljubicastim/plavim akcentima (#6C63FF). Pomenuti korišćenje Inter font familije za citljivost.]</w:t>
-      </w:r>
-    </w:p>
-    <w:p>
-      <w:pPr>
-        <w:pStyle w:val="Heading2"/>
-      </w:pPr>
-      <w:bookmarkStart w:id="121" w:name="_Toc227588154"/>
-      <w:bookmarkStart w:id="122" w:name="_Toc227588924"/>
-      <w:r>
-        <w:t>8.2  Ž</w:t>
-      </w:r>
-      <w:r>
-        <w:t>icani okvir</w:t>
-      </w:r>
-      <w:bookmarkEnd w:id="121"/>
-      <w:bookmarkEnd w:id="122"/>
-    </w:p>
-    <w:p>
-      <w:pPr>
-        <w:spacing w:before="120" w:after="180" w:line="360" w:lineRule="auto"/>
-      </w:pPr>
-      <w:r>
-        <w:rPr>
-          <w:i/>
-          <w:iCs/>
-          <w:color w:val="CC4400"/>
-        </w:rPr>
-        <w:t>[PLACEHOLDER: Opisati proces izrade wireframe-ova pre implementacije. Koji alat je koriscen (Figma, AdobeXD, Whimsical, ili papir)? Koji layout sistemi su razmatrani? Dodati slike wireframe-ova ako postoje, ili opisati ključne dizajnerske odluke: pozicija sidebar-a, grid raspored kartica, pozicija SpotifyPlayer-a u donjem desnom uglu.]</w:t>
+        <w:t xml:space="preserve">[Slika 10: Wireframe Dashboard stranice — raspored kartica i sidebar navigacije]</w:t>
       </w:r>
     </w:p>
     <w:p>
@@ -7054,15 +7459,86 @@
     </w:p>
     <w:p>
       <w:pPr>
-        <w:spacing w:before="120" w:after="180" w:line="360" w:lineRule="auto"/>
+        <w:pStyle w:val="Normal"/>
+        <w:spacing w:after="80"/>
+        <w:jc w:val="center"/>
       </w:pPr>
       <w:r>
         <w:rPr>
           <w:i/>
-          <w:iCs/>
-          <w:color w:val="CC4400"/>
+          <w:color w:val="555555"/>
         </w:rPr>
-        <w:t>[PLACEHOLDER: Dodati screenshots finalnog dizajna svih stranica: Login, Dashboard, Feed, Connected, Notifications, Settings.]</w:t>
+        <w:t xml:space="preserve">[Slika 11: Finalni dizajn — Login stranica]</w:t>
+      </w:r>
+    </w:p>
+    <w:p>
+      <w:pPr>
+        <w:pStyle w:val="Normal"/>
+        <w:spacing w:after="80"/>
+        <w:jc w:val="center"/>
+      </w:pPr>
+      <w:r>
+        <w:rPr>
+          <w:i/>
+          <w:color w:val="555555"/>
+        </w:rPr>
+        <w:t xml:space="preserve">[Slika 12: Finalni dizajn — Dashboard u tamnoj temi]</w:t>
+      </w:r>
+    </w:p>
+    <w:p>
+      <w:pPr>
+        <w:pStyle w:val="Normal"/>
+        <w:spacing w:after="80"/>
+        <w:jc w:val="center"/>
+      </w:pPr>
+      <w:r>
+        <w:rPr>
+          <w:i/>
+          <w:color w:val="555555"/>
+        </w:rPr>
+        <w:t xml:space="preserve">[Slika 13: Finalni dizajn — Feed stranica sa Instagram objavama]</w:t>
+      </w:r>
+    </w:p>
+    <w:p>
+      <w:pPr>
+        <w:pStyle w:val="Normal"/>
+        <w:spacing w:after="80"/>
+        <w:jc w:val="center"/>
+      </w:pPr>
+      <w:r>
+        <w:rPr>
+          <w:i/>
+          <w:color w:val="555555"/>
+        </w:rPr>
+        <w:t xml:space="preserve">[Slika 14: Finalni dizajn — Connected Accounts stranica]</w:t>
+      </w:r>
+    </w:p>
+    <w:p>
+      <w:pPr>
+        <w:pStyle w:val="Normal"/>
+        <w:spacing w:after="80"/>
+        <w:jc w:val="center"/>
+      </w:pPr>
+      <w:r>
+        <w:rPr>
+          <w:i/>
+          <w:color w:val="555555"/>
+        </w:rPr>
+        <w:t xml:space="preserve">[Slika 15: Finalni dizajn — Notifications stranica]</w:t>
+      </w:r>
+    </w:p>
+    <w:p>
+      <w:pPr>
+        <w:pStyle w:val="Normal"/>
+        <w:spacing w:after="80"/>
+        <w:jc w:val="center"/>
+      </w:pPr>
+      <w:r>
+        <w:rPr>
+          <w:i/>
+          <w:color w:val="555555"/>
+        </w:rPr>
+        <w:t xml:space="preserve">[Slika 16: Finalni dizajn — Settings stranica]</w:t>
       </w:r>
     </w:p>
     <w:p>
@@ -7115,15 +7591,85 @@
     </w:p>
     <w:p>
       <w:pPr>
-        <w:spacing w:before="120" w:after="180" w:line="360" w:lineRule="auto"/>
+        <w:pStyle w:val="Normal"/>
+        <w:spacing w:after="160"/>
+      </w:pPr>
+      <w:r>
+        <w:t xml:space="preserve">Za testiranje Social Media Manager API-ja kreirana je Postman kolekcija sa dvanaest zahteva grupisanih po kontrolerima. Testiranje je sprovedeno sledećim redosledom koji simulira realan tok korisničke sesije:</w:t>
+      </w:r>
+    </w:p>
+    <w:p>
+      <w:pPr>
+        <w:pStyle w:val="Normal"/>
+        <w:spacing w:after="80"/>
+        <w:ind w:left="720"/>
+      </w:pPr>
+      <w:r>
+        <w:t xml:space="preserve">(1) POST /api/auth/register — slanje JSON tela sa korisničkim imenom i lozinkom. Očekivani odgovor: HTTP 200 OK sa porukom o uspešnoj registraciji.</w:t>
+      </w:r>
+    </w:p>
+    <w:p>
+      <w:pPr>
+        <w:pStyle w:val="Normal"/>
+        <w:spacing w:after="80"/>
+        <w:ind w:left="720"/>
+      </w:pPr>
+      <w:r>
+        <w:t xml:space="preserve">(2) POST /api/auth/login — slanje ispravnih kredencijala. Očekivani odgovor: HTTP 200 OK sa JSON telom koje sadrži polja token i username. Primljeni token kopira se u Postman Environment varijablu za dalje korišćenje.</w:t>
+      </w:r>
+    </w:p>
+    <w:p>
+      <w:pPr>
+        <w:pStyle w:val="Normal"/>
+        <w:spacing w:after="80"/>
+        <w:ind w:left="720"/>
+      </w:pPr>
+      <w:r>
+        <w:t xml:space="preserve">(3) GET /api/users/me — zahtev sa Bearer tokenom u Authorization headeru. Očekivani odgovor: HTTP 200 OK sa korisničkim imenom trenutno prijavljenog korisnika.</w:t>
+      </w:r>
+    </w:p>
+    <w:p>
+      <w:pPr>
+        <w:pStyle w:val="Normal"/>
+        <w:spacing w:after="80"/>
+        <w:ind w:left="720"/>
+      </w:pPr>
+      <w:r>
+        <w:t xml:space="preserve">(4) GET /api/instagram/profile — dohvatanje podataka profila. Očekivani odgovor: JSON sa username, followers_count i media_count poljima.</w:t>
+      </w:r>
+    </w:p>
+    <w:p>
+      <w:pPr>
+        <w:pStyle w:val="Normal"/>
+        <w:spacing w:after="80"/>
+        <w:ind w:left="720"/>
+      </w:pPr>
+      <w:r>
+        <w:t xml:space="preserve">(5) GET /api/spotify/status — provera statusa Spotify konekcije. Očekivani odgovor: JSON sa poljem connected: true/false.</w:t>
+      </w:r>
+    </w:p>
+    <w:p>
+      <w:pPr>
+        <w:pStyle w:val="Normal"/>
+        <w:spacing w:after="80"/>
+        <w:ind w:left="720"/>
+      </w:pPr>
+      <w:r>
+        <w:t xml:space="preserve">(6) GET /api/users/me bez tokena — testiranje zaštite ruta. Očekivani odgovor: HTTP 403 Forbidden.</w:t>
+      </w:r>
+    </w:p>
+    <w:p>
+      <w:pPr>
+        <w:pStyle w:val="Normal"/>
+        <w:spacing w:after="80"/>
+        <w:jc w:val="center"/>
       </w:pPr>
       <w:r>
         <w:rPr>
           <w:i/>
-          <w:iCs/>
-          <w:color w:val="CC4400"/>
+          <w:color w:val="555555"/>
         </w:rPr>
-        <w:t>[PLACEHOLDER: Opisati testiranje u Postman-u. Navesti konkretne primere: (1) POST /api/auth/register - ocekivani odgovor 200 OK, (2) POST /api/auth/login sa ispravnim kredencijalima - odgovor sadrzi JWT token, (3) GET /api/users/me sa Bearer tokenom u headeru - vraca korisničko ime. Dodati screenshot Postman interfejsa.]</w:t>
+        <w:t xml:space="preserve">[Slika 17: Postman kolekcija sa primerima zahteva i odgovora]</w:t>
       </w:r>
     </w:p>
     <w:p>
@@ -7148,15 +7694,34 @@
     </w:p>
     <w:p>
       <w:pPr>
-        <w:spacing w:before="120" w:after="180" w:line="360" w:lineRule="auto"/>
+        <w:pStyle w:val="Normal"/>
+        <w:spacing w:after="160"/>
+      </w:pPr>
+      <w:r>
+        <w:t xml:space="preserve">Swagger UI interfejs organizuje sve endpoint-e u četiri grupe prema kontrolerima: auth-controller (/api/auth/register, /api/auth/login), user-controller (/api/users, /api/users/{id}, /api/users/me), instagram-controller (/api/instagram/profile, /api/instagram/media, /api/instagram/notifications) i spotify-controller (/api/spotify/login, /api/spotify/callback, /api/spotify/current-track, /api/spotify/recent-tracks, /api/spotify/status).</w:t>
+      </w:r>
+    </w:p>
+    <w:p>
+      <w:pPr>
+        <w:pStyle w:val="Normal"/>
+        <w:spacing w:after="160"/>
+      </w:pPr>
+      <w:r>
+        <w:t xml:space="preserve">Za testiranje zaštićenih ruta direktno iz Swagger UI-ja, koristi se Authorize dugme u gornjem desnom uglu interfejsa. Klikom na dugme otvara se dijalog u koji se unosi JWT token u formatu "Bearer eyJhbGciOiJIUzI1NiJ9...". Nakon autorizacije, Swagger automatski dodaje Authorization header svim narednim zahtevima, što omogućava testiranje zaštićenih endpoint-a bez ručnog unošenja tokena.</w:t>
+      </w:r>
+    </w:p>
+    <w:p>
+      <w:pPr>
+        <w:pStyle w:val="Normal"/>
+        <w:spacing w:after="80"/>
+        <w:jc w:val="center"/>
       </w:pPr>
       <w:r>
         <w:rPr>
           <w:i/>
-          <w:iCs/>
-          <w:color w:val="CC4400"/>
+          <w:color w:val="555555"/>
         </w:rPr>
-        <w:t>[PLACEHOLDER: Dodati screenshot Swagger UI-ja koji prikazuje listu svih endpoint-a. Opisati korišćenje Authorize dugmeta za unos JWT tokena i testiranje zaštićenih ruta direktno iz Swagger UI-ja.]</w:t>
+        <w:t xml:space="preserve">[Slika 18: Swagger UI sa listom svih endpoint-a grupisanih po kontrolerima]</w:t>
       </w:r>
     </w:p>
     <w:p>
@@ -7173,24 +7738,169 @@
     </w:p>
     <w:p>
       <w:pPr>
-        <w:spacing w:before="120" w:after="180" w:line="360" w:lineRule="auto"/>
+        <w:pStyle w:val="Normal"/>
+        <w:spacing w:after="160"/>
+      </w:pPr>
+      <w:r>
+        <w:t xml:space="preserve">Primer 1 — Uspešna prijava korisnika:</w:t>
+      </w:r>
+    </w:p>
+    <w:p>
+      <w:pPr>
+        <w:pStyle w:val="Normal"/>
+        <w:spacing w:after="160"/>
+      </w:pPr>
+      <w:r>
+        <w:t xml:space="preserve">Zahtev (POST /api/auth/login):</w:t>
+      </w:r>
+    </w:p>
+    <w:p>
+      <w:pPr>
+        <w:pStyle w:val="Normal"/>
+        <w:spacing w:after="80"/>
+        <w:ind w:left="720"/>
+      </w:pPr>
+      <w:r>
+        <w:rPr>
+          <w:rFonts w:ascii="Courier New" w:hAnsi="Courier New"/>
+          <w:sz w:val="18"/>
+          <w:szCs w:val="18"/>
+        </w:rPr>
+        <w:t xml:space="preserve">{ "username": "testuser", "password": "lozinka123" }</w:t>
+      </w:r>
+    </w:p>
+    <w:p>
+      <w:pPr>
+        <w:pStyle w:val="Normal"/>
+        <w:spacing w:after="160"/>
+      </w:pPr>
+      <w:r>
+        <w:t xml:space="preserve">Odgovor (HTTP 200 OK):</w:t>
+      </w:r>
+    </w:p>
+    <w:p>
+      <w:pPr>
+        <w:pStyle w:val="Normal"/>
+        <w:spacing w:after="80"/>
+        <w:ind w:left="720"/>
+      </w:pPr>
+      <w:r>
+        <w:rPr>
+          <w:rFonts w:ascii="Courier New" w:hAnsi="Courier New"/>
+          <w:sz w:val="18"/>
+          <w:szCs w:val="18"/>
+        </w:rPr>
+        <w:t xml:space="preserve">{ "token": "eyJhbGciOiJIUzI1NiJ9.eyJzdWIiOiJ0ZXN0...", "username": "testuser" }</w:t>
+      </w:r>
+    </w:p>
+    <w:p>
+      <w:pPr>
+        <w:pStyle w:val="Normal"/>
+        <w:spacing w:after="160"/>
+      </w:pPr>
+      <w:r>
+        <w:t xml:space="preserve">Primer 2 — Dohvatanje Instagram profila (GET /api/instagram/profile):</w:t>
+      </w:r>
+    </w:p>
+    <w:p>
+      <w:pPr>
+        <w:pStyle w:val="Normal"/>
+        <w:spacing w:after="80"/>
+        <w:ind w:left="720"/>
+      </w:pPr>
+      <w:r>
+        <w:rPr>
+          <w:rFonts w:ascii="Courier New" w:hAnsi="Courier New"/>
+          <w:sz w:val="18"/>
+          <w:szCs w:val="18"/>
+        </w:rPr>
+        <w:t xml:space="preserve">{ "id": "123456789", "username": "korisnik", "followers_count": 342, "media_count": 87 }</w:t>
+      </w:r>
+    </w:p>
+    <w:p>
+      <w:pPr>
+        <w:pStyle w:val="Normal"/>
+        <w:spacing w:after="160"/>
+      </w:pPr>
+      <w:r>
+        <w:t xml:space="preserve">Primer 3 — Provera Spotify statusa (GET /api/spotify/status):</w:t>
+      </w:r>
+    </w:p>
+    <w:p>
+      <w:pPr>
+        <w:pStyle w:val="Normal"/>
+        <w:spacing w:after="80"/>
+        <w:ind w:left="720"/>
+      </w:pPr>
+      <w:r>
+        <w:rPr>
+          <w:rFonts w:ascii="Courier New" w:hAnsi="Courier New"/>
+          <w:sz w:val="18"/>
+          <w:szCs w:val="18"/>
+        </w:rPr>
+        <w:t xml:space="preserve">{ "connected": true, "username": "spotify_korisnik" }</w:t>
+      </w:r>
+    </w:p>
+    <w:p>
+      <w:pPr>
+        <w:pStyle w:val="Normal"/>
+        <w:spacing w:after="160"/>
+      </w:pPr>
+      <w:r>
+        <w:t xml:space="preserve">Primer 4 — Dohvatanje trenutno aktivnog korisnika (GET /api/users/me):</w:t>
+      </w:r>
+    </w:p>
+    <w:p>
+      <w:pPr>
+        <w:pStyle w:val="Normal"/>
+        <w:spacing w:after="80"/>
+        <w:ind w:left="720"/>
+      </w:pPr>
+      <w:r>
+        <w:rPr>
+          <w:rFonts w:ascii="Courier New" w:hAnsi="Courier New"/>
+          <w:sz w:val="18"/>
+          <w:szCs w:val="18"/>
+        </w:rPr>
+        <w:t xml:space="preserve">{ "username": "testuser", "email": "test@example.com" }</w:t>
+      </w:r>
+    </w:p>
+    <w:p>
+      <w:pPr>
+        <w:pStyle w:val="Normal"/>
+        <w:spacing w:after="160"/>
+      </w:pPr>
+      <w:r>
+        <w:t xml:space="preserve">Primer 5 — Neautorizovani pristup zaštićenoj ruti bez JWT tokena (GET /api/users/me):</w:t>
+      </w:r>
+    </w:p>
+    <w:p>
+      <w:pPr>
+        <w:pStyle w:val="Normal"/>
+        <w:spacing w:after="80"/>
+        <w:ind w:left="720"/>
+      </w:pPr>
+      <w:r>
+        <w:rPr>
+          <w:rFonts w:ascii="Courier New" w:hAnsi="Courier New"/>
+          <w:sz w:val="18"/>
+          <w:szCs w:val="18"/>
+        </w:rPr>
+        <w:t xml:space="preserve">HTTP 403 Forbidden</w:t>
+      </w:r>
+    </w:p>
+    <w:p>
+      <w:pPr>
+        <w:pStyle w:val="Normal"/>
+        <w:spacing w:after="80"/>
+        <w:jc w:val="center"/>
       </w:pPr>
       <w:r>
         <w:rPr>
           <w:i/>
-          <w:iCs/>
-          <w:color w:val="CC4400"/>
+          <w:color w:val="555555"/>
         </w:rPr>
-        <w:t xml:space="preserve">[PLACEHOLDER: Dodati konkretne primere zahteva i odgovora sa screenshotima ili JSON blokovima. Predlozeni primeri: (1) Uspesna prijava - telo zahteva i JWT odgovor, (2) GET /api/instagram/profile - primer JSON odgovora sa stvarnim podacima profila, (3) GET /api/spotify/status - connected true/false, (4) GET </w:t>
-      </w:r>
-      <w:r>
-        <w:rPr>
-          <w:i/>
-          <w:iCs/>
-          <w:color w:val="CC4400"/>
-        </w:rPr>
-        <w:lastRenderedPageBreak/>
-        <w:t>/api/users/me - username, (5) Primer greske - 403 Forbidden pri pristupu zasticonoj ruti bez tokena.]</w:t>
+        <w:t xml:space="preserve">[Slika 19: Primeri zahteva i odgovora u Postman-u]</w:t>
       </w:r>
     </w:p>
     <w:p>
@@ -7215,28 +7925,48 @@
     </w:p>
     <w:p>
       <w:pPr>
-        <w:spacing w:before="120" w:after="180" w:line="360" w:lineRule="auto"/>
+        <w:pStyle w:val="Normal"/>
+        <w:spacing w:after="160"/>
+      </w:pPr>
+      <w:r>
+        <w:t xml:space="preserve">Svi ciljevi postavljeni u Poglavlju 4 uspešno su ostvareni kroz implementaciju opisanu u Poglavlju 7. Korisnik može da se registruje i prijavi na sistem, pregleda Dashboard sa agregiranim prikazom aktivnosti, konzumira Instagram feed sa objavama direktno u aplikaciji, upravlja obaveštenjima sa svih povezanih platformi, poveže Spotify nalog putem OAuth 2.0 toka i sluša muziku putem integrisanog SpotifyPlayer widget-a, kao i da upravlja podešavanjima svog naloga.</w:t>
+      </w:r>
+    </w:p>
+    <w:p>
+      <w:pPr>
+        <w:pStyle w:val="Normal"/>
+        <w:spacing w:after="160"/>
+      </w:pPr>
+      <w:r>
+        <w:t xml:space="preserve">Aplikacija uspešno rešava sve tri kategorije problema identifikovane u Poglavlju 2: fragmentaciju (objedinjavanjem više platformi na jednom mestu), gubitak fokusa (eliminisanjem potrebe za prelaskom između aplikacija) i neefikasnost (agregiranim prikazom notifikacija i aktivnosti). Korisnik sada može da dobije pregled svog digitalnog prisustva bez napuštanja aplikacije.</w:t>
+      </w:r>
+    </w:p>
+    <w:p>
+      <w:pPr>
+        <w:pStyle w:val="Normal"/>
+        <w:spacing w:after="80"/>
+        <w:jc w:val="center"/>
       </w:pPr>
       <w:r>
         <w:rPr>
           <w:i/>
-          <w:iCs/>
-          <w:color w:val="CC4400"/>
+          <w:color w:val="555555"/>
         </w:rPr>
-        <w:t>[PLACEHOLDER: Opisati ostvarene rezultate projekta. Koji su ciljevi postavljeni u Poglavlju 4 ostvareni? Navesti funkcionalne karakteristike sistema koji radi: korisnik moze da se registruje i prijavi, vidi dashboard sa Instagram podacima, pregleda feed sa objavama, upravlja notifikacijama, poveze Spotify nalog i slusa muziku putem SpotifyPlayer-a, menja podešavanja naloga.]</w:t>
-      </w:r>
-    </w:p>
-    <w:p>
-      <w:pPr>
-        <w:spacing w:before="120" w:after="180" w:line="360" w:lineRule="auto"/>
+        <w:t xml:space="preserve">[Slika 20: Funkcionalna aplikacija — prikaz Dashboard-a sa podacima sa Instagram i Spotify platformi]</w:t>
+      </w:r>
+    </w:p>
+    <w:p>
+      <w:pPr>
+        <w:pStyle w:val="Normal"/>
+        <w:spacing w:after="80"/>
+        <w:jc w:val="center"/>
       </w:pPr>
       <w:r>
         <w:rPr>
           <w:i/>
-          <w:iCs/>
-          <w:color w:val="CC4400"/>
+          <w:color w:val="555555"/>
         </w:rPr>
-        <w:t>[PLACEHOLDER: Dodati screenshot ili video demonstracije funkcionalne aplikacije. Navesti tehničke karakteristike: backend API sa 14 endpoint-a, frontend sa 8 stranica i 3 komponente, integracija sa 2 eksterna API-ja.]</w:t>
+        <w:t xml:space="preserve">[Slika 21: Prikaz funkcionalne aplikacije u upotrebi — Dashboard sa podacima sa Instagram i Spotify platformi]</w:t>
       </w:r>
     </w:p>
     <w:p>
@@ -7611,28 +8341,47 @@
     </w:p>
     <w:p>
       <w:pPr>
-        <w:spacing w:before="120" w:after="180" w:line="360" w:lineRule="auto"/>
-      </w:pPr>
-      <w:r>
-        <w:rPr>
-          <w:i/>
-          <w:iCs/>
-          <w:color w:val="CC4400"/>
-        </w:rPr>
-        <w:t>[PLACEHOLDER: Napisati zakljucak koji rezimira ceo rad. Poci od opisanog problema (poglavlje 2) i pokazati kako je razvijeno rešenje (poglavlje 7) taj problem adresiralo. Naglasiti naucene lekcije tokom razvoja - sta je bilo izazovno (npr. implementacija JWT filtera, razumevanje OAuth 2.0 flow-a za Spotify, upravljanje CORS-om), a sta je teklo glatko.]</w:t>
-      </w:r>
-    </w:p>
-    <w:p>
-      <w:pPr>
-        <w:spacing w:before="120" w:after="180" w:line="360" w:lineRule="auto"/>
-      </w:pPr>
-      <w:r>
-        <w:rPr>
-          <w:i/>
-          <w:iCs/>
-          <w:color w:val="CC4400"/>
-        </w:rPr>
-        <w:t>[PLACEHOLDER: Reflektovati na vrednost projekta: da li je cilj postignut? Da li aplikacija zaista rešava problem koji je identifikovan? Sta bi se uradilo drugacije da se projekat radi iznova?]</w:t>
+        <w:pStyle w:val="Normal"/>
+        <w:spacing w:after="160"/>
+      </w:pPr>
+      <w:r>
+        <w:t xml:space="preserve">Ovaj rad polazi od konkretnog i svakodnevnog problema: korisnici modernog interneta prisiljeni su da upravljaju rastućim brojem digitalnih platformi koje ne komuniciraju međusobno, što dovodi do fragmentacije iskustva, gubitka fokusa i operativnih neefikasnosti. Kroz analizu postojećih rešenja — Hootsuite-a, Buffer-a i Later-a — utvrđeno je da profesionalni alati za upravljanje društvenim mrežama ne adresiraju potrebe individualnih korisnika: previše su složeni, cenovno nepristupačni i usmereni na poslovni marketing umesto na lično konzumiranje sadržaja.</w:t>
+      </w:r>
+    </w:p>
+    <w:p>
+      <w:pPr>
+        <w:pStyle w:val="Normal"/>
+        <w:spacing w:after="160"/>
+      </w:pPr>
+      <w:r>
+        <w:t xml:space="preserve">Razvijeno rešenje — Social Media Manager web aplikacija — direktno adresira ove nedostatke. Implementacijom full-stack arhitekture zasnovane na Spring Boot backend-u i React frontend-u, sa JWT autentifikacijom i integracijom Instagram i Spotify API-ja, realizovan je funkcionalan sistem koji korisniku pruža jedinstven pregled digitalnih aktivnosti na jednom mestu.</w:t>
+      </w:r>
+    </w:p>
+    <w:p>
+      <w:pPr>
+        <w:pStyle w:val="Normal"/>
+        <w:spacing w:after="160"/>
+      </w:pPr>
+      <w:r>
+        <w:t xml:space="preserve">Tokom razvoja, posebno izazovnim pokazali su se implementacija JWT autentifikacijskog filtera i ispravna konfiguracija Spring Security lanca filtera, razumevanje i implementacija OAuth 2.0 Authorization Code toka za Spotify integraciju, kao i upravljanje CORS politikama između razvojnih servera na različitim portovima. Rešavanje ovih izazova doprinelo je produbljivanju razumevanja savremenih web bezbednosnih mehanizama.</w:t>
+      </w:r>
+    </w:p>
+    <w:p>
+      <w:pPr>
+        <w:pStyle w:val="Normal"/>
+        <w:spacing w:after="160"/>
+      </w:pPr>
+      <w:r>
+        <w:t xml:space="preserve">Postavljeni cilj je postignut: aplikacija funkcioniše kao centralizovana platforma koja smanjuje potrebu za prelaskom između aplikacija i pruža agregiran pregled digitalnih aktivnosti. Korisnik može da prati Instagram aktivnost, sluša muziku kroz integrisani plejer i upravlja nalozima sa jednog interfejsa.</w:t>
+      </w:r>
+    </w:p>
+    <w:p>
+      <w:pPr>
+        <w:pStyle w:val="Normal"/>
+        <w:spacing w:after="160"/>
+      </w:pPr>
+      <w:r>
+        <w:t xml:space="preserve">Da se projekat radi iznova, odabir perzistentne baze podataka poput PostgreSQL-a bio bi prioritet od prvog dana, kako bi se izbegli kompromisi vezani za H2 in-memory bazu. Takođe, implementacija potpunog Instagram OAuth toka umesto statičnog access tokena bila bi neophodna za produkcijsku upotrebu. Iskustvo stečeno tokom ovog projekta pruža čvrstu osnovu za dalji razvoj u smeru koji je opisan u Poglavlju 11.</w:t>
       </w:r>
     </w:p>
     <w:p>
@@ -7785,15 +8534,74 @@
     </w:p>
     <w:p>
       <w:pPr>
-        <w:spacing w:before="120" w:after="180" w:line="360" w:lineRule="auto"/>
-      </w:pPr>
-      <w:r>
-        <w:rPr>
-          <w:i/>
-          <w:iCs/>
-          <w:color w:val="CC4400"/>
-        </w:rPr>
-        <w:t>[PLACEHOLDER: Dodati sve ostale knjige, clanke i izvore koriscene tokom izrade rada u IEEE ili APA formatu citiranja.]</w:t>
+        <w:pStyle w:val="Normal"/>
+        <w:spacing w:after="160"/>
+      </w:pPr>
+      <w:r>
+        <w:t xml:space="preserve">[16] Walls, C. (2022). Spring Boot in Action, Second Edition. Manning Publications.</w:t>
+      </w:r>
+    </w:p>
+    <w:p>
+      <w:pPr>
+        <w:pStyle w:val="Normal"/>
+        <w:spacing w:after="160"/>
+      </w:pPr>
+      <w:r>
+        <w:t xml:space="preserve">[17] Wieruch, R. (2023). The Road to React. Leanpub.</w:t>
+      </w:r>
+    </w:p>
+    <w:p>
+      <w:pPr>
+        <w:pStyle w:val="Normal"/>
+        <w:spacing w:after="160"/>
+      </w:pPr>
+      <w:r>
+        <w:t xml:space="preserve">[18] Fielding, R. T. (2000). Architectural Styles and the Design of Network-based Software Architectures. Doktorska disertacija, University of California, Irvine.</w:t>
+      </w:r>
+    </w:p>
+    <w:p>
+      <w:pPr>
+        <w:pStyle w:val="Normal"/>
+        <w:spacing w:after="160"/>
+      </w:pPr>
+      <w:r>
+        <w:t xml:space="preserve">[19] Jones, M., Bradley, J., Sakimura, N. (2015). RFC 7519 - JSON Web Token. IETF.</w:t>
+      </w:r>
+    </w:p>
+    <w:p>
+      <w:pPr>
+        <w:pStyle w:val="Normal"/>
+        <w:spacing w:after="160"/>
+      </w:pPr>
+      <w:r>
+        <w:t xml:space="preserve">[20] Meta Platforms, Inc. (2024). Instagram Graph API Reference. Dostupno na: https://developers.facebook.com/docs/instagram-api/reference/</w:t>
+      </w:r>
+    </w:p>
+    <w:p>
+      <w:pPr>
+        <w:pStyle w:val="Normal"/>
+        <w:spacing w:after="160"/>
+      </w:pPr>
+      <w:r>
+        <w:t xml:space="preserve">[21] Spotify AB. (2024). Authorization Code Flow. Dostupno na: https://developer.spotify.com/documentation/web-api/tutorials/code-flow</w:t>
+      </w:r>
+    </w:p>
+    <w:p>
+      <w:pPr>
+        <w:pStyle w:val="Normal"/>
+        <w:spacing w:after="160"/>
+      </w:pPr>
+      <w:r>
+        <w:t xml:space="preserve">[22] Statista Research Department. (2023). Number of social media platforms used per month worldwide. Statista.</w:t>
+      </w:r>
+    </w:p>
+    <w:p>
+      <w:pPr>
+        <w:pStyle w:val="Normal"/>
+        <w:spacing w:after="160"/>
+      </w:pPr>
+      <w:r>
+        <w:t xml:space="preserve">[23] Mark, G., Gudith, D., Klocke, U. (2008). The Cost of Interrupted Work: More Speed and Stress. Proceedings of the SIGCHI Conference on Human Factors in Computing Systems.</w:t>
       </w:r>
     </w:p>
     <w:sectPr>

</xml_diff>